<commit_message>
Exam-style dotted answer lines in PDFs; typeable answer boxes in Word docs
- PDFs: answer space after each question now renders as rows of dotted
  lines (exam-paper style), spaced ~9mm, sized to the question's marks.
- Word: the answer space is now a bordered single-cell answer box with a
  minimum height (scaled to marks, atLeast rule) that grows as the
  student types - exam-paper style boxes students click into and type.
Regenerated all 226 DOCX + 200 PDFs and reassembled Course/ (650 files).

Co-Authored-By: Claude Fable 5 <noreply@anthropic.com>
Claude-Session: https://claude.ai/code/session_01SezF6hpA66tCGV6oPmvEpP
</commit_message>
<xml_diff>
--- a/Course/1 Component 1 - Computer Systems/1.1 Processors, Input, Output and Storage/00 Topic Resources/6 End-of-Topic Worksheet (editable).docx
+++ b/Course/1 Component 1 - Computer Systems/1.1 Processors, Input, Output and Storage/00 Topic Resources/6 End-of-Topic Worksheet (editable).docx
@@ -2068,22 +2068,32 @@
         <w:t xml:space="preserve"> (AO1)</w:t>
       </w:r>
     </w:p>
-    <w:p>
-      <w:pPr>
-        <w:spacing w:before="260"/>
-        <w:pBdr>
-          <w:bottom w:val="single" w:sz="4" w:space="1" w:color="AAB4C0"/>
-        </w:pBdr>
-      </w:pPr>
-    </w:p>
-    <w:p>
-      <w:pPr>
-        <w:spacing w:before="260"/>
-        <w:pBdr>
-          <w:bottom w:val="single" w:sz="4" w:space="1" w:color="AAB4C0"/>
-        </w:pBdr>
-      </w:pPr>
-    </w:p>
+    <w:tbl>
+      <w:tblPr>
+        <w:tblStyle w:val="TableGrid"/>
+        <w:tblW w:type="auto" w:w="0"/>
+        <w:tblLook w:firstColumn="1" w:firstRow="1" w:lastColumn="0" w:lastRow="0" w:noHBand="0" w:noVBand="1" w:val="04A0"/>
+      </w:tblPr>
+      <w:tblGrid>
+        <w:gridCol w:w="8640"/>
+      </w:tblGrid>
+      <w:tr>
+        <w:trPr>
+          <w:trHeight w:val="680" w:hRule="atLeast"/>
+        </w:trPr>
+        <w:tc>
+          <w:tcPr>
+            <w:tcW w:type="dxa" w:w="8640"/>
+          </w:tcPr>
+          <w:p>
+            <w:pPr>
+              <w:spacing w:before="40"/>
+            </w:pPr>
+          </w:p>
+        </w:tc>
+      </w:tr>
+    </w:tbl>
+    <w:p/>
     <w:p>
       <w:pPr>
         <w:pBdr>
@@ -2121,30 +2131,32 @@
         <w:t xml:space="preserve"> (AO1)</w:t>
       </w:r>
     </w:p>
-    <w:p>
-      <w:pPr>
-        <w:spacing w:before="260"/>
-        <w:pBdr>
-          <w:bottom w:val="single" w:sz="4" w:space="1" w:color="AAB4C0"/>
-        </w:pBdr>
-      </w:pPr>
-    </w:p>
-    <w:p>
-      <w:pPr>
-        <w:spacing w:before="260"/>
-        <w:pBdr>
-          <w:bottom w:val="single" w:sz="4" w:space="1" w:color="AAB4C0"/>
-        </w:pBdr>
-      </w:pPr>
-    </w:p>
-    <w:p>
-      <w:pPr>
-        <w:spacing w:before="260"/>
-        <w:pBdr>
-          <w:bottom w:val="single" w:sz="4" w:space="1" w:color="AAB4C0"/>
-        </w:pBdr>
-      </w:pPr>
-    </w:p>
+    <w:tbl>
+      <w:tblPr>
+        <w:tblStyle w:val="TableGrid"/>
+        <w:tblW w:type="auto" w:w="0"/>
+        <w:tblLook w:firstColumn="1" w:firstRow="1" w:lastColumn="0" w:lastRow="0" w:noHBand="0" w:noVBand="1" w:val="04A0"/>
+      </w:tblPr>
+      <w:tblGrid>
+        <w:gridCol w:w="8640"/>
+      </w:tblGrid>
+      <w:tr>
+        <w:trPr>
+          <w:trHeight w:val="1020" w:hRule="atLeast"/>
+        </w:trPr>
+        <w:tc>
+          <w:tcPr>
+            <w:tcW w:type="dxa" w:w="8640"/>
+          </w:tcPr>
+          <w:p>
+            <w:pPr>
+              <w:spacing w:before="40"/>
+            </w:pPr>
+          </w:p>
+        </w:tc>
+      </w:tr>
+    </w:tbl>
+    <w:p/>
     <w:p>
       <w:pPr>
         <w:pBdr>
@@ -2217,38 +2229,32 @@
         <w:t xml:space="preserve"> (AO2)</w:t>
       </w:r>
     </w:p>
-    <w:p>
-      <w:pPr>
-        <w:spacing w:before="260"/>
-        <w:pBdr>
-          <w:bottom w:val="single" w:sz="4" w:space="1" w:color="AAB4C0"/>
-        </w:pBdr>
-      </w:pPr>
-    </w:p>
-    <w:p>
-      <w:pPr>
-        <w:spacing w:before="260"/>
-        <w:pBdr>
-          <w:bottom w:val="single" w:sz="4" w:space="1" w:color="AAB4C0"/>
-        </w:pBdr>
-      </w:pPr>
-    </w:p>
-    <w:p>
-      <w:pPr>
-        <w:spacing w:before="260"/>
-        <w:pBdr>
-          <w:bottom w:val="single" w:sz="4" w:space="1" w:color="AAB4C0"/>
-        </w:pBdr>
-      </w:pPr>
-    </w:p>
-    <w:p>
-      <w:pPr>
-        <w:spacing w:before="260"/>
-        <w:pBdr>
-          <w:bottom w:val="single" w:sz="4" w:space="1" w:color="AAB4C0"/>
-        </w:pBdr>
-      </w:pPr>
-    </w:p>
+    <w:tbl>
+      <w:tblPr>
+        <w:tblStyle w:val="TableGrid"/>
+        <w:tblW w:type="auto" w:w="0"/>
+        <w:tblLook w:firstColumn="1" w:firstRow="1" w:lastColumn="0" w:lastRow="0" w:noHBand="0" w:noVBand="1" w:val="04A0"/>
+      </w:tblPr>
+      <w:tblGrid>
+        <w:gridCol w:w="8640"/>
+      </w:tblGrid>
+      <w:tr>
+        <w:trPr>
+          <w:trHeight w:val="1360" w:hRule="atLeast"/>
+        </w:trPr>
+        <w:tc>
+          <w:tcPr>
+            <w:tcW w:type="dxa" w:w="8640"/>
+          </w:tcPr>
+          <w:p>
+            <w:pPr>
+              <w:spacing w:before="40"/>
+            </w:pPr>
+          </w:p>
+        </w:tc>
+      </w:tr>
+    </w:tbl>
+    <w:p/>
     <w:p>
       <w:pPr>
         <w:pBdr>
@@ -2314,54 +2320,32 @@
         <w:t xml:space="preserve"> (AO2)</w:t>
       </w:r>
     </w:p>
-    <w:p>
-      <w:pPr>
-        <w:spacing w:before="260"/>
-        <w:pBdr>
-          <w:bottom w:val="single" w:sz="4" w:space="1" w:color="AAB4C0"/>
-        </w:pBdr>
-      </w:pPr>
-    </w:p>
-    <w:p>
-      <w:pPr>
-        <w:spacing w:before="260"/>
-        <w:pBdr>
-          <w:bottom w:val="single" w:sz="4" w:space="1" w:color="AAB4C0"/>
-        </w:pBdr>
-      </w:pPr>
-    </w:p>
-    <w:p>
-      <w:pPr>
-        <w:spacing w:before="260"/>
-        <w:pBdr>
-          <w:bottom w:val="single" w:sz="4" w:space="1" w:color="AAB4C0"/>
-        </w:pBdr>
-      </w:pPr>
-    </w:p>
-    <w:p>
-      <w:pPr>
-        <w:spacing w:before="260"/>
-        <w:pBdr>
-          <w:bottom w:val="single" w:sz="4" w:space="1" w:color="AAB4C0"/>
-        </w:pBdr>
-      </w:pPr>
-    </w:p>
-    <w:p>
-      <w:pPr>
-        <w:spacing w:before="260"/>
-        <w:pBdr>
-          <w:bottom w:val="single" w:sz="4" w:space="1" w:color="AAB4C0"/>
-        </w:pBdr>
-      </w:pPr>
-    </w:p>
-    <w:p>
-      <w:pPr>
-        <w:spacing w:before="260"/>
-        <w:pBdr>
-          <w:bottom w:val="single" w:sz="4" w:space="1" w:color="AAB4C0"/>
-        </w:pBdr>
-      </w:pPr>
-    </w:p>
+    <w:tbl>
+      <w:tblPr>
+        <w:tblStyle w:val="TableGrid"/>
+        <w:tblW w:type="auto" w:w="0"/>
+        <w:tblLook w:firstColumn="1" w:firstRow="1" w:lastColumn="0" w:lastRow="0" w:noHBand="0" w:noVBand="1" w:val="04A0"/>
+      </w:tblPr>
+      <w:tblGrid>
+        <w:gridCol w:w="8640"/>
+      </w:tblGrid>
+      <w:tr>
+        <w:trPr>
+          <w:trHeight w:val="2040" w:hRule="atLeast"/>
+        </w:trPr>
+        <w:tc>
+          <w:tcPr>
+            <w:tcW w:type="dxa" w:w="8640"/>
+          </w:tcPr>
+          <w:p>
+            <w:pPr>
+              <w:spacing w:before="40"/>
+            </w:pPr>
+          </w:p>
+        </w:tc>
+      </w:tr>
+    </w:tbl>
+    <w:p/>
     <w:p>
       <w:pPr>
         <w:pBdr>
@@ -2450,54 +2434,32 @@
         <w:t xml:space="preserve"> (AO2)</w:t>
       </w:r>
     </w:p>
-    <w:p>
-      <w:pPr>
-        <w:spacing w:before="260"/>
-        <w:pBdr>
-          <w:bottom w:val="single" w:sz="4" w:space="1" w:color="AAB4C0"/>
-        </w:pBdr>
-      </w:pPr>
-    </w:p>
-    <w:p>
-      <w:pPr>
-        <w:spacing w:before="260"/>
-        <w:pBdr>
-          <w:bottom w:val="single" w:sz="4" w:space="1" w:color="AAB4C0"/>
-        </w:pBdr>
-      </w:pPr>
-    </w:p>
-    <w:p>
-      <w:pPr>
-        <w:spacing w:before="260"/>
-        <w:pBdr>
-          <w:bottom w:val="single" w:sz="4" w:space="1" w:color="AAB4C0"/>
-        </w:pBdr>
-      </w:pPr>
-    </w:p>
-    <w:p>
-      <w:pPr>
-        <w:spacing w:before="260"/>
-        <w:pBdr>
-          <w:bottom w:val="single" w:sz="4" w:space="1" w:color="AAB4C0"/>
-        </w:pBdr>
-      </w:pPr>
-    </w:p>
-    <w:p>
-      <w:pPr>
-        <w:spacing w:before="260"/>
-        <w:pBdr>
-          <w:bottom w:val="single" w:sz="4" w:space="1" w:color="AAB4C0"/>
-        </w:pBdr>
-      </w:pPr>
-    </w:p>
-    <w:p>
-      <w:pPr>
-        <w:spacing w:before="260"/>
-        <w:pBdr>
-          <w:bottom w:val="single" w:sz="4" w:space="1" w:color="AAB4C0"/>
-        </w:pBdr>
-      </w:pPr>
-    </w:p>
+    <w:tbl>
+      <w:tblPr>
+        <w:tblStyle w:val="TableGrid"/>
+        <w:tblW w:type="auto" w:w="0"/>
+        <w:tblLook w:firstColumn="1" w:firstRow="1" w:lastColumn="0" w:lastRow="0" w:noHBand="0" w:noVBand="1" w:val="04A0"/>
+      </w:tblPr>
+      <w:tblGrid>
+        <w:gridCol w:w="8640"/>
+      </w:tblGrid>
+      <w:tr>
+        <w:trPr>
+          <w:trHeight w:val="2040" w:hRule="atLeast"/>
+        </w:trPr>
+        <w:tc>
+          <w:tcPr>
+            <w:tcW w:type="dxa" w:w="8640"/>
+          </w:tcPr>
+          <w:p>
+            <w:pPr>
+              <w:spacing w:before="40"/>
+            </w:pPr>
+          </w:p>
+        </w:tc>
+      </w:tr>
+    </w:tbl>
+    <w:p/>
     <w:tbl>
       <w:tblPr>
         <w:tblStyle w:val="TableGrid"/>
@@ -2682,38 +2644,32 @@
         <w:t xml:space="preserve"> (AO1)</w:t>
       </w:r>
     </w:p>
-    <w:p>
-      <w:pPr>
-        <w:spacing w:before="260"/>
-        <w:pBdr>
-          <w:bottom w:val="single" w:sz="4" w:space="1" w:color="AAB4C0"/>
-        </w:pBdr>
-      </w:pPr>
-    </w:p>
-    <w:p>
-      <w:pPr>
-        <w:spacing w:before="260"/>
-        <w:pBdr>
-          <w:bottom w:val="single" w:sz="4" w:space="1" w:color="AAB4C0"/>
-        </w:pBdr>
-      </w:pPr>
-    </w:p>
-    <w:p>
-      <w:pPr>
-        <w:spacing w:before="260"/>
-        <w:pBdr>
-          <w:bottom w:val="single" w:sz="4" w:space="1" w:color="AAB4C0"/>
-        </w:pBdr>
-      </w:pPr>
-    </w:p>
-    <w:p>
-      <w:pPr>
-        <w:spacing w:before="260"/>
-        <w:pBdr>
-          <w:bottom w:val="single" w:sz="4" w:space="1" w:color="AAB4C0"/>
-        </w:pBdr>
-      </w:pPr>
-    </w:p>
+    <w:tbl>
+      <w:tblPr>
+        <w:tblStyle w:val="TableGrid"/>
+        <w:tblW w:type="auto" w:w="0"/>
+        <w:tblLook w:firstColumn="1" w:firstRow="1" w:lastColumn="0" w:lastRow="0" w:noHBand="0" w:noVBand="1" w:val="04A0"/>
+      </w:tblPr>
+      <w:tblGrid>
+        <w:gridCol w:w="8640"/>
+      </w:tblGrid>
+      <w:tr>
+        <w:trPr>
+          <w:trHeight w:val="1360" w:hRule="atLeast"/>
+        </w:trPr>
+        <w:tc>
+          <w:tcPr>
+            <w:tcW w:type="dxa" w:w="8640"/>
+          </w:tcPr>
+          <w:p>
+            <w:pPr>
+              <w:spacing w:before="40"/>
+            </w:pPr>
+          </w:p>
+        </w:tc>
+      </w:tr>
+    </w:tbl>
+    <w:p/>
     <w:p>
       <w:pPr>
         <w:pBdr>
@@ -2779,54 +2735,32 @@
         <w:t xml:space="preserve"> (AO1)</w:t>
       </w:r>
     </w:p>
-    <w:p>
-      <w:pPr>
-        <w:spacing w:before="260"/>
-        <w:pBdr>
-          <w:bottom w:val="single" w:sz="4" w:space="1" w:color="AAB4C0"/>
-        </w:pBdr>
-      </w:pPr>
-    </w:p>
-    <w:p>
-      <w:pPr>
-        <w:spacing w:before="260"/>
-        <w:pBdr>
-          <w:bottom w:val="single" w:sz="4" w:space="1" w:color="AAB4C0"/>
-        </w:pBdr>
-      </w:pPr>
-    </w:p>
-    <w:p>
-      <w:pPr>
-        <w:spacing w:before="260"/>
-        <w:pBdr>
-          <w:bottom w:val="single" w:sz="4" w:space="1" w:color="AAB4C0"/>
-        </w:pBdr>
-      </w:pPr>
-    </w:p>
-    <w:p>
-      <w:pPr>
-        <w:spacing w:before="260"/>
-        <w:pBdr>
-          <w:bottom w:val="single" w:sz="4" w:space="1" w:color="AAB4C0"/>
-        </w:pBdr>
-      </w:pPr>
-    </w:p>
-    <w:p>
-      <w:pPr>
-        <w:spacing w:before="260"/>
-        <w:pBdr>
-          <w:bottom w:val="single" w:sz="4" w:space="1" w:color="AAB4C0"/>
-        </w:pBdr>
-      </w:pPr>
-    </w:p>
-    <w:p>
-      <w:pPr>
-        <w:spacing w:before="260"/>
-        <w:pBdr>
-          <w:bottom w:val="single" w:sz="4" w:space="1" w:color="AAB4C0"/>
-        </w:pBdr>
-      </w:pPr>
-    </w:p>
+    <w:tbl>
+      <w:tblPr>
+        <w:tblStyle w:val="TableGrid"/>
+        <w:tblW w:type="auto" w:w="0"/>
+        <w:tblLook w:firstColumn="1" w:firstRow="1" w:lastColumn="0" w:lastRow="0" w:noHBand="0" w:noVBand="1" w:val="04A0"/>
+      </w:tblPr>
+      <w:tblGrid>
+        <w:gridCol w:w="8640"/>
+      </w:tblGrid>
+      <w:tr>
+        <w:trPr>
+          <w:trHeight w:val="2040" w:hRule="atLeast"/>
+        </w:trPr>
+        <w:tc>
+          <w:tcPr>
+            <w:tcW w:type="dxa" w:w="8640"/>
+          </w:tcPr>
+          <w:p>
+            <w:pPr>
+              <w:spacing w:before="40"/>
+            </w:pPr>
+          </w:p>
+        </w:tc>
+      </w:tr>
+    </w:tbl>
+    <w:p/>
     <w:p>
       <w:pPr>
         <w:pBdr>
@@ -2894,102 +2828,32 @@
         <w:t xml:space="preserve"> (AO3)</w:t>
       </w:r>
     </w:p>
-    <w:p>
-      <w:pPr>
-        <w:spacing w:before="260"/>
-        <w:pBdr>
-          <w:bottom w:val="single" w:sz="4" w:space="1" w:color="AAB4C0"/>
-        </w:pBdr>
-      </w:pPr>
-    </w:p>
-    <w:p>
-      <w:pPr>
-        <w:spacing w:before="260"/>
-        <w:pBdr>
-          <w:bottom w:val="single" w:sz="4" w:space="1" w:color="AAB4C0"/>
-        </w:pBdr>
-      </w:pPr>
-    </w:p>
-    <w:p>
-      <w:pPr>
-        <w:spacing w:before="260"/>
-        <w:pBdr>
-          <w:bottom w:val="single" w:sz="4" w:space="1" w:color="AAB4C0"/>
-        </w:pBdr>
-      </w:pPr>
-    </w:p>
-    <w:p>
-      <w:pPr>
-        <w:spacing w:before="260"/>
-        <w:pBdr>
-          <w:bottom w:val="single" w:sz="4" w:space="1" w:color="AAB4C0"/>
-        </w:pBdr>
-      </w:pPr>
-    </w:p>
-    <w:p>
-      <w:pPr>
-        <w:spacing w:before="260"/>
-        <w:pBdr>
-          <w:bottom w:val="single" w:sz="4" w:space="1" w:color="AAB4C0"/>
-        </w:pBdr>
-      </w:pPr>
-    </w:p>
-    <w:p>
-      <w:pPr>
-        <w:spacing w:before="260"/>
-        <w:pBdr>
-          <w:bottom w:val="single" w:sz="4" w:space="1" w:color="AAB4C0"/>
-        </w:pBdr>
-      </w:pPr>
-    </w:p>
-    <w:p>
-      <w:pPr>
-        <w:spacing w:before="260"/>
-        <w:pBdr>
-          <w:bottom w:val="single" w:sz="4" w:space="1" w:color="AAB4C0"/>
-        </w:pBdr>
-      </w:pPr>
-    </w:p>
-    <w:p>
-      <w:pPr>
-        <w:spacing w:before="260"/>
-        <w:pBdr>
-          <w:bottom w:val="single" w:sz="4" w:space="1" w:color="AAB4C0"/>
-        </w:pBdr>
-      </w:pPr>
-    </w:p>
-    <w:p>
-      <w:pPr>
-        <w:spacing w:before="260"/>
-        <w:pBdr>
-          <w:bottom w:val="single" w:sz="4" w:space="1" w:color="AAB4C0"/>
-        </w:pBdr>
-      </w:pPr>
-    </w:p>
-    <w:p>
-      <w:pPr>
-        <w:spacing w:before="260"/>
-        <w:pBdr>
-          <w:bottom w:val="single" w:sz="4" w:space="1" w:color="AAB4C0"/>
-        </w:pBdr>
-      </w:pPr>
-    </w:p>
-    <w:p>
-      <w:pPr>
-        <w:spacing w:before="260"/>
-        <w:pBdr>
-          <w:bottom w:val="single" w:sz="4" w:space="1" w:color="AAB4C0"/>
-        </w:pBdr>
-      </w:pPr>
-    </w:p>
-    <w:p>
-      <w:pPr>
-        <w:spacing w:before="260"/>
-        <w:pBdr>
-          <w:bottom w:val="single" w:sz="4" w:space="1" w:color="AAB4C0"/>
-        </w:pBdr>
-      </w:pPr>
-    </w:p>
+    <w:tbl>
+      <w:tblPr>
+        <w:tblStyle w:val="TableGrid"/>
+        <w:tblW w:type="auto" w:w="0"/>
+        <w:tblLook w:firstColumn="1" w:firstRow="1" w:lastColumn="0" w:lastRow="0" w:noHBand="0" w:noVBand="1" w:val="04A0"/>
+      </w:tblPr>
+      <w:tblGrid>
+        <w:gridCol w:w="8640"/>
+      </w:tblGrid>
+      <w:tr>
+        <w:trPr>
+          <w:trHeight w:val="4080" w:hRule="atLeast"/>
+        </w:trPr>
+        <w:tc>
+          <w:tcPr>
+            <w:tcW w:type="dxa" w:w="8640"/>
+          </w:tcPr>
+          <w:p>
+            <w:pPr>
+              <w:spacing w:before="40"/>
+            </w:pPr>
+          </w:p>
+        </w:tc>
+      </w:tr>
+    </w:tbl>
+    <w:p/>
     <w:p>
       <w:r>
         <w:rPr>

</xml_diff>